<commit_message>
fix: los DOCX ahora incrustan los diagramas Excalidraw
Pandoc descartaba los img en HTML crudo con ruta web absoluta; el script
convierte cada ficha-img a markdown apuntando al PNG local (Word no
admite SVG) y compila con --dpi 200 para que el diagrama quepa en A4.
30 imagenes incrustadas en los 15 DOCX, verificadas por word/media.
</commit_message>
<xml_diff>
--- a/docx/01-el-mostrador/01-el-mostrador.docx
+++ b/docx/01-el-mostrador/01-el-mostrador.docx
@@ -600,7 +600,7 @@
     </w:p>
     <w:bookmarkEnd w:id="16"/>
     <w:bookmarkEnd w:id="17"/>
-    <w:bookmarkStart w:id="24" w:name="el-guion-de-los-5-pasos"/>
+    <w:bookmarkStart w:id="27" w:name="el-guion-de-los-5-pasos"/>
     <w:p>
       <w:pPr>
         <w:pStyle w:val="Heading1"/>
@@ -705,7 +705,7 @@
       </w:r>
     </w:p>
     <w:bookmarkEnd w:id="18"/>
-    <w:bookmarkStart w:id="19" w:name="lo-que-hay-que-saber"/>
+    <w:bookmarkStart w:id="22" w:name="lo-que-hay-que-saber"/>
     <w:p>
       <w:pPr>
         <w:pStyle w:val="Heading2"/>
@@ -1159,19 +1159,61 @@
     </w:p>
     <w:p>
       <w:pPr>
-        <w:pStyle w:val="BodyText"/>
-      </w:pPr>
-    </w:p>
-    <w:p>
-      <w:pPr>
-        <w:pStyle w:val="BodyText"/>
+        <w:pStyle w:val="CaptionedFigure"/>
+      </w:pPr>
+      <w:r>
+        <w:drawing>
+          <wp:inline>
+            <wp:extent cx="5334000" cy="1209675"/>
+            <wp:effectExtent b="0" l="0" r="0" t="0"/>
+            <wp:docPr descr="Guion de 5 pasos en el mostrador" title="" id="20" name="Picture"/>
+            <a:graphic>
+              <a:graphicData uri="http://schemas.openxmlformats.org/drawingml/2006/picture">
+                <pic:pic>
+                  <pic:nvPicPr>
+                    <pic:cNvPr descr="public/img/01-el-mostrador/01-guion-5-pasos.png" id="21" name="Picture"/>
+                    <pic:cNvPicPr>
+                      <a:picLocks noChangeArrowheads="1" noChangeAspect="1"/>
+                    </pic:cNvPicPr>
+                  </pic:nvPicPr>
+                  <pic:blipFill>
+                    <a:blip r:embed="rId19"/>
+                    <a:stretch>
+                      <a:fillRect/>
+                    </a:stretch>
+                  </pic:blipFill>
+                  <pic:spPr bwMode="auto">
+                    <a:xfrm>
+                      <a:off x="0" y="0"/>
+                      <a:ext cx="5334000" cy="1209675"/>
+                    </a:xfrm>
+                    <a:prstGeom prst="rect">
+                      <a:avLst/>
+                    </a:prstGeom>
+                    <a:noFill/>
+                    <a:ln w="9525">
+                      <a:noFill/>
+                      <a:headEnd/>
+                      <a:tailEnd/>
+                    </a:ln>
+                  </pic:spPr>
+                </pic:pic>
+              </a:graphicData>
+            </a:graphic>
+          </wp:inline>
+        </w:drawing>
+      </w:r>
+    </w:p>
+    <w:p>
+      <w:pPr>
+        <w:pStyle w:val="ImageCaption"/>
       </w:pPr>
       <w:r>
         <w:t xml:space="preserve">Guion de 5 pasos en el mostrador</w:t>
       </w:r>
     </w:p>
-    <w:bookmarkEnd w:id="19"/>
-    <w:bookmarkStart w:id="20" w:name="a-por-ellos"/>
+    <w:bookmarkEnd w:id="22"/>
+    <w:bookmarkStart w:id="23" w:name="a-por-ellos"/>
     <w:p>
       <w:pPr>
         <w:pStyle w:val="Heading2"/>
@@ -1605,8 +1647,8 @@
         </w:pict>
       </w:r>
     </w:p>
-    <w:bookmarkEnd w:id="20"/>
-    <w:bookmarkStart w:id="21" w:name="mini-dinámica-el-cliente-mudo-10-min"/>
+    <w:bookmarkEnd w:id="23"/>
+    <w:bookmarkStart w:id="24" w:name="mini-dinámica-el-cliente-mudo-10-min"/>
     <w:p>
       <w:pPr>
         <w:pStyle w:val="Heading2"/>
@@ -1706,8 +1748,8 @@
         </w:pict>
       </w:r>
     </w:p>
-    <w:bookmarkEnd w:id="21"/>
-    <w:bookmarkStart w:id="23" w:name="para-el-profe-soluciones-y-pistas"/>
+    <w:bookmarkEnd w:id="24"/>
+    <w:bookmarkStart w:id="26" w:name="para-el-profe-soluciones-y-pistas"/>
     <w:p>
       <w:pPr>
         <w:pStyle w:val="Heading2"/>
@@ -1770,7 +1812,7 @@
       <w:r>
         <w:t xml:space="preserve"> </w:t>
       </w:r>
-      <w:hyperlink r:id="rId22">
+      <w:hyperlink r:id="rId25">
         <w:r>
           <w:rPr>
             <w:rStyle w:val="Hyperlink"/>
@@ -1797,7 +1839,7 @@
       <w:r>
         <w:t xml:space="preserve"> </w:t>
       </w:r>
-      <w:hyperlink r:id="rId22">
+      <w:hyperlink r:id="rId25">
         <w:r>
           <w:rPr>
             <w:rStyle w:val="Hyperlink"/>
@@ -1833,9 +1875,9 @@
         </w:r>
       </w:hyperlink>
     </w:p>
-    <w:bookmarkEnd w:id="23"/>
-    <w:bookmarkEnd w:id="24"/>
-    <w:bookmarkStart w:id="30" w:name="objeciones-y-clientes-difíciles"/>
+    <w:bookmarkEnd w:id="26"/>
+    <w:bookmarkEnd w:id="27"/>
+    <w:bookmarkStart w:id="36" w:name="objeciones-y-clientes-difíciles"/>
     <w:p>
       <w:pPr>
         <w:pStyle w:val="Heading1"/>
@@ -1914,7 +1956,7 @@
         </w:pict>
       </w:r>
     </w:p>
-    <w:bookmarkStart w:id="25" w:name="en-corto-1"/>
+    <w:bookmarkStart w:id="28" w:name="en-corto-1"/>
     <w:p>
       <w:pPr>
         <w:pStyle w:val="Heading2"/>
@@ -1964,8 +2006,8 @@
         </w:pict>
       </w:r>
     </w:p>
-    <w:bookmarkEnd w:id="25"/>
-    <w:bookmarkStart w:id="26" w:name="lo-que-hay-que-saber-1"/>
+    <w:bookmarkEnd w:id="28"/>
+    <w:bookmarkStart w:id="32" w:name="lo-que-hay-que-saber-1"/>
     <w:p>
       <w:pPr>
         <w:pStyle w:val="Heading2"/>
@@ -2360,19 +2402,61 @@
     </w:p>
     <w:p>
       <w:pPr>
-        <w:pStyle w:val="BodyText"/>
-      </w:pPr>
-    </w:p>
-    <w:p>
-      <w:pPr>
-        <w:pStyle w:val="BodyText"/>
+        <w:pStyle w:val="CaptionedFigure"/>
+      </w:pPr>
+      <w:r>
+        <w:drawing>
+          <wp:inline>
+            <wp:extent cx="5334000" cy="2667000"/>
+            <wp:effectExtent b="0" l="0" r="0" t="0"/>
+            <wp:docPr descr="Clientes difíciles: bajar el tono" title="" id="30" name="Picture"/>
+            <a:graphic>
+              <a:graphicData uri="http://schemas.openxmlformats.org/drawingml/2006/picture">
+                <pic:pic>
+                  <pic:nvPicPr>
+                    <pic:cNvPr descr="public/img/01-el-mostrador/02-clientes-dificiles.png" id="31" name="Picture"/>
+                    <pic:cNvPicPr>
+                      <a:picLocks noChangeArrowheads="1" noChangeAspect="1"/>
+                    </pic:cNvPicPr>
+                  </pic:nvPicPr>
+                  <pic:blipFill>
+                    <a:blip r:embed="rId29"/>
+                    <a:stretch>
+                      <a:fillRect/>
+                    </a:stretch>
+                  </pic:blipFill>
+                  <pic:spPr bwMode="auto">
+                    <a:xfrm>
+                      <a:off x="0" y="0"/>
+                      <a:ext cx="5334000" cy="2667000"/>
+                    </a:xfrm>
+                    <a:prstGeom prst="rect">
+                      <a:avLst/>
+                    </a:prstGeom>
+                    <a:noFill/>
+                    <a:ln w="9525">
+                      <a:noFill/>
+                      <a:headEnd/>
+                      <a:tailEnd/>
+                    </a:ln>
+                  </pic:spPr>
+                </pic:pic>
+              </a:graphicData>
+            </a:graphic>
+          </wp:inline>
+        </w:drawing>
+      </w:r>
+    </w:p>
+    <w:p>
+      <w:pPr>
+        <w:pStyle w:val="ImageCaption"/>
       </w:pPr>
       <w:r>
         <w:t xml:space="preserve">Clientes difíciles: bajar el tono</w:t>
       </w:r>
     </w:p>
-    <w:bookmarkEnd w:id="26"/>
-    <w:bookmarkStart w:id="27" w:name="a-por-ellos-1"/>
+    <w:bookmarkEnd w:id="32"/>
+    <w:bookmarkStart w:id="33" w:name="a-por-ellos-1"/>
     <w:p>
       <w:pPr>
         <w:pStyle w:val="Heading2"/>
@@ -2739,8 +2823,8 @@
         </w:pict>
       </w:r>
     </w:p>
-    <w:bookmarkEnd w:id="27"/>
-    <w:bookmarkStart w:id="28" w:name="mini-dinámica-semáforo-del-tono-8-min"/>
+    <w:bookmarkEnd w:id="33"/>
+    <w:bookmarkStart w:id="34" w:name="mini-dinámica-semáforo-del-tono-8-min"/>
     <w:p>
       <w:pPr>
         <w:pStyle w:val="Heading2"/>
@@ -2857,8 +2941,8 @@
         </w:pict>
       </w:r>
     </w:p>
-    <w:bookmarkEnd w:id="28"/>
-    <w:bookmarkStart w:id="29" w:name="para-el-profe-soluciones-y-pistas-1"/>
+    <w:bookmarkEnd w:id="34"/>
+    <w:bookmarkStart w:id="35" w:name="para-el-profe-soluciones-y-pistas-1"/>
     <w:p>
       <w:pPr>
         <w:pStyle w:val="Heading2"/>
@@ -2924,7 +3008,7 @@
       <w:r>
         <w:t xml:space="preserve"> </w:t>
       </w:r>
-      <w:hyperlink r:id="rId22">
+      <w:hyperlink r:id="rId25">
         <w:r>
           <w:rPr>
             <w:rStyle w:val="Hyperlink"/>
@@ -2987,9 +3071,9 @@
         </w:r>
       </w:hyperlink>
     </w:p>
-    <w:bookmarkEnd w:id="29"/>
-    <w:bookmarkEnd w:id="30"/>
-    <w:bookmarkStart w:id="39" w:name="juegos-y-retos"/>
+    <w:bookmarkEnd w:id="35"/>
+    <w:bookmarkEnd w:id="36"/>
+    <w:bookmarkStart w:id="45" w:name="juegos-y-retos"/>
     <w:p>
       <w:pPr>
         <w:pStyle w:val="Heading1"/>
@@ -3053,7 +3137,7 @@
         </w:pict>
       </w:r>
     </w:p>
-    <w:bookmarkStart w:id="31" w:name="en-corto-2"/>
+    <w:bookmarkStart w:id="37" w:name="en-corto-2"/>
     <w:p>
       <w:pPr>
         <w:pStyle w:val="Heading2"/>
@@ -3090,8 +3174,8 @@
         </w:pict>
       </w:r>
     </w:p>
-    <w:bookmarkEnd w:id="31"/>
-    <w:bookmarkStart w:id="32" w:name="el-fail-de-dani"/>
+    <w:bookmarkEnd w:id="37"/>
+    <w:bookmarkStart w:id="38" w:name="el-fail-de-dani"/>
     <w:p>
       <w:pPr>
         <w:pStyle w:val="Heading2"/>
@@ -3267,8 +3351,8 @@
         </w:pict>
       </w:r>
     </w:p>
-    <w:bookmarkEnd w:id="32"/>
-    <w:bookmarkStart w:id="33" w:name="juego-1-mostrador-a-ciegas-15-min"/>
+    <w:bookmarkEnd w:id="38"/>
+    <w:bookmarkStart w:id="39" w:name="juego-1-mostrador-a-ciegas-15-min"/>
     <w:p>
       <w:pPr>
         <w:pStyle w:val="Heading2"/>
@@ -3431,8 +3515,8 @@
         </w:pict>
       </w:r>
     </w:p>
-    <w:bookmarkEnd w:id="33"/>
-    <w:bookmarkStart w:id="34" w:name="juego-2-el-cliente-secreto-20-min"/>
+    <w:bookmarkEnd w:id="39"/>
+    <w:bookmarkStart w:id="40" w:name="juego-2-el-cliente-secreto-20-min"/>
     <w:p>
       <w:pPr>
         <w:pStyle w:val="Heading2"/>
@@ -3631,8 +3715,8 @@
         </w:pict>
       </w:r>
     </w:p>
-    <w:bookmarkEnd w:id="34"/>
-    <w:bookmarkStart w:id="35" w:name="juego-3-la-frase-que-salva-10-min"/>
+    <w:bookmarkEnd w:id="40"/>
+    <w:bookmarkStart w:id="41" w:name="juego-3-la-frase-que-salva-10-min"/>
     <w:p>
       <w:pPr>
         <w:pStyle w:val="Heading2"/>
@@ -3705,8 +3789,8 @@
         </w:pict>
       </w:r>
     </w:p>
-    <w:bookmarkEnd w:id="35"/>
-    <w:bookmarkStart w:id="36" w:name="logros"/>
+    <w:bookmarkEnd w:id="41"/>
+    <w:bookmarkStart w:id="42" w:name="logros"/>
     <w:p>
       <w:pPr>
         <w:pStyle w:val="Heading2"/>
@@ -3943,8 +4027,8 @@
         </w:pict>
       </w:r>
     </w:p>
-    <w:bookmarkEnd w:id="36"/>
-    <w:bookmarkStart w:id="37" w:name="reto-final"/>
+    <w:bookmarkEnd w:id="42"/>
+    <w:bookmarkStart w:id="43" w:name="reto-final"/>
     <w:p>
       <w:pPr>
         <w:pStyle w:val="Heading2"/>
@@ -4089,8 +4173,8 @@
         </w:pict>
       </w:r>
     </w:p>
-    <w:bookmarkEnd w:id="37"/>
-    <w:bookmarkStart w:id="38" w:name="para-el-profe"/>
+    <w:bookmarkEnd w:id="43"/>
+    <w:bookmarkStart w:id="44" w:name="para-el-profe"/>
     <w:p>
       <w:pPr>
         <w:pStyle w:val="Heading2"/>
@@ -4162,7 +4246,7 @@
       <w:r>
         <w:t xml:space="preserve"> </w:t>
       </w:r>
-      <w:hyperlink r:id="rId22">
+      <w:hyperlink r:id="rId25">
         <w:r>
           <w:rPr>
             <w:rStyle w:val="Hyperlink"/>
@@ -4225,8 +4309,8 @@
         </w:r>
       </w:hyperlink>
     </w:p>
-    <w:bookmarkEnd w:id="38"/>
-    <w:bookmarkEnd w:id="39"/>
+    <w:bookmarkEnd w:id="44"/>
+    <w:bookmarkEnd w:id="45"/>
     <w:sectPr>
       <w:footnotePr>
         <w:numRestart w:val="eachSect"/>

</xml_diff>